<commit_message>
docs: broaden office laptop project scope
</commit_message>
<xml_diff>
--- a/03_phan-tich/phong-van/2026-07-09_kich-ban-phong-van_v3.0_draft_AI.docx
+++ b/03_phan-tich/phong-van/2026-07-09_kich-ban-phong-van_v3.0_draft_AI.docx
@@ -39,8 +39,16 @@
         <w:rPr>
           <w:rFonts w:asciiTheme="majorHAnsi" w:hAnsiTheme="majorHAnsi" w:cstheme="majorHAnsi"/>
         </w:rPr>
-        <w:t xml:space="preserve"> Bộ tiêu chí ra quyết định lựa chọn laptop cho nhân viên văn phòng tại Việt Nam (tầm giá 20-25 triệu đồng) </w:t>
-      </w:r>
+        <w:t xml:space="preserve"> Bộ tiêu chí ra quyết định lựa chọn laptop cho nhân viên văn phòng tại Việt Nam </w:t>
+      </w:r>
+    </w:p>
+    <w:p>
+      <w:pPr>
+        <w:spacing w:beforeLines="60" w:before="144" w:afterLines="100" w:after="240" w:line="312" w:lineRule="auto"/>
+        <w:rPr>
+          <w:rFonts w:asciiTheme="majorHAnsi" w:hAnsiTheme="majorHAnsi" w:cstheme="majorHAnsi"/>
+        </w:rPr>
+      </w:pPr>
       <w:r>
         <w:rPr>
           <w:rFonts w:asciiTheme="majorHAnsi" w:hAnsiTheme="majorHAnsi" w:cstheme="majorHAnsi"/>
@@ -54,6 +62,14 @@
         </w:rPr>
         <w:t xml:space="preserve"> Chuyên gia thu mua B2B, tư vấn bán lẻ, kỹ thuật viên/IT Helpdesk, người dùng kỳ cựu </w:t>
       </w:r>
+    </w:p>
+    <w:p>
+      <w:pPr>
+        <w:spacing w:beforeLines="60" w:before="144" w:afterLines="100" w:after="240" w:line="312" w:lineRule="auto"/>
+        <w:rPr>
+          <w:rFonts w:asciiTheme="majorHAnsi" w:hAnsiTheme="majorHAnsi" w:cstheme="majorHAnsi"/>
+        </w:rPr>
+      </w:pPr>
       <w:r>
         <w:rPr>
           <w:rFonts w:asciiTheme="majorHAnsi" w:hAnsiTheme="majorHAnsi" w:cstheme="majorHAnsi"/>
@@ -67,6 +83,14 @@
         </w:rPr>
         <w:t xml:space="preserve"> 20-30 phút · </w:t>
       </w:r>
+    </w:p>
+    <w:p>
+      <w:pPr>
+        <w:spacing w:beforeLines="60" w:before="144" w:afterLines="100" w:after="240" w:line="312" w:lineRule="auto"/>
+        <w:rPr>
+          <w:rFonts w:asciiTheme="majorHAnsi" w:hAnsiTheme="majorHAnsi" w:cstheme="majorHAnsi"/>
+        </w:rPr>
+      </w:pPr>
       <w:r>
         <w:rPr>
           <w:rFonts w:asciiTheme="majorHAnsi" w:hAnsiTheme="majorHAnsi" w:cstheme="majorHAnsi"/>
@@ -80,6 +104,14 @@
         </w:rPr>
         <w:t xml:space="preserve"> 13 (kèm câu thăm dò) </w:t>
       </w:r>
+    </w:p>
+    <w:p>
+      <w:pPr>
+        <w:spacing w:beforeLines="60" w:before="144" w:afterLines="100" w:after="240" w:line="312" w:lineRule="auto"/>
+        <w:rPr>
+          <w:rFonts w:asciiTheme="majorHAnsi" w:hAnsiTheme="majorHAnsi" w:cstheme="majorHAnsi"/>
+        </w:rPr>
+      </w:pPr>
       <w:r>
         <w:rPr>
           <w:rFonts w:asciiTheme="majorHAnsi" w:hAnsiTheme="majorHAnsi" w:cstheme="majorHAnsi"/>
@@ -93,6 +125,14 @@
         </w:rPr>
         <w:t xml:space="preserve"> Vòng Delphi định tính (Round 1) nhằm xác thực và tinh chỉnh 14 tiêu chí trước khi lượng hóa bằng AHP </w:t>
       </w:r>
+    </w:p>
+    <w:p>
+      <w:pPr>
+        <w:spacing w:beforeLines="60" w:before="144" w:afterLines="100" w:after="240" w:line="312" w:lineRule="auto"/>
+        <w:rPr>
+          <w:rFonts w:asciiTheme="majorHAnsi" w:hAnsiTheme="majorHAnsi" w:cstheme="majorHAnsi"/>
+        </w:rPr>
+      </w:pPr>
       <w:r>
         <w:rPr>
           <w:rFonts w:asciiTheme="majorHAnsi" w:hAnsiTheme="majorHAnsi" w:cstheme="majorHAnsi"/>
@@ -126,6 +166,7 @@
       <w:tblPr>
         <w:tblStyle w:val="TableGrid"/>
         <w:tblW w:w="0" w:type="auto"/>
+        <w:jc w:val="center"/>
         <w:tblLook w:val="04A0" w:firstRow="1" w:lastRow="0" w:firstColumn="1" w:lastColumn="0" w:noHBand="0" w:noVBand="1"/>
       </w:tblPr>
       <w:tblGrid>
@@ -133,6 +174,9 @@
         <w:gridCol w:w="2496"/>
       </w:tblGrid>
       <w:tr>
+        <w:trPr>
+          <w:jc w:val="center"/>
+        </w:trPr>
         <w:tc>
           <w:tcPr>
             <w:tcW w:w="0" w:type="auto"/>
@@ -173,6 +217,9 @@
         </w:tc>
       </w:tr>
       <w:tr>
+        <w:trPr>
+          <w:jc w:val="center"/>
+        </w:trPr>
         <w:tc>
           <w:tcPr>
             <w:tcW w:w="0" w:type="auto"/>
@@ -213,6 +260,9 @@
         </w:tc>
       </w:tr>
       <w:tr>
+        <w:trPr>
+          <w:jc w:val="center"/>
+        </w:trPr>
         <w:tc>
           <w:tcPr>
             <w:tcW w:w="0" w:type="auto"/>
@@ -253,6 +303,9 @@
         </w:tc>
       </w:tr>
       <w:tr>
+        <w:trPr>
+          <w:jc w:val="center"/>
+        </w:trPr>
         <w:tc>
           <w:tcPr>
             <w:tcW w:w="0" w:type="auto"/>
@@ -293,6 +346,9 @@
         </w:tc>
       </w:tr>
       <w:tr>
+        <w:trPr>
+          <w:jc w:val="center"/>
+        </w:trPr>
         <w:tc>
           <w:tcPr>
             <w:tcW w:w="0" w:type="auto"/>
@@ -333,6 +389,9 @@
         </w:tc>
       </w:tr>
       <w:tr>
+        <w:trPr>
+          <w:jc w:val="center"/>
+        </w:trPr>
         <w:tc>
           <w:tcPr>
             <w:tcW w:w="0" w:type="auto"/>
@@ -383,6 +442,20 @@
     </w:p>
     <w:p>
       <w:pPr>
+        <w:rPr>
+          <w:rFonts w:asciiTheme="majorHAnsi" w:hAnsiTheme="majorHAnsi" w:cstheme="majorHAnsi"/>
+          <w:b/>
+        </w:rPr>
+      </w:pPr>
+      <w:r>
+        <w:rPr>
+          <w:rFonts w:asciiTheme="majorHAnsi" w:hAnsiTheme="majorHAnsi" w:cstheme="majorHAnsi"/>
+        </w:rPr>
+        <w:br w:type="page"/>
+      </w:r>
+    </w:p>
+    <w:p>
+      <w:pPr>
         <w:pStyle w:val="Heading2"/>
         <w:spacing w:beforeLines="60" w:before="144" w:afterLines="100" w:after="240" w:line="312" w:lineRule="auto"/>
         <w:rPr>
@@ -397,6 +470,7 @@
           <w:sz w:val="24"/>
           <w:szCs w:val="24"/>
         </w:rPr>
+        <w:lastRenderedPageBreak/>
         <w:t>Phần 0 — Lời chào và chấp thuận tham gia (Informed Consent)</w:t>
       </w:r>
     </w:p>
@@ -425,21 +499,20 @@
         <w:rPr>
           <w:rFonts w:asciiTheme="majorHAnsi" w:hAnsiTheme="majorHAnsi" w:cstheme="majorHAnsi"/>
         </w:rPr>
-        <w:t>"Em chào anh/chị, cảm ơn anh/chị đã dành thời gian cho buổi trao đổi hôm nay. Em là [tên], sinh viên [trường/lớp]. Nhóm em đang thực hiện một nghiên cứu học thuật nhằm xây dựng bộ tiêu chí ra quyết định mua laptop dành cho nhân viên văn phòng ở tầm giá 20-25 triệu đồng. Nhóm em đã tổng hợp một danh sách tiêu chí từ các nghiên cứu quốc tế, và buổi trao đổi này là để lắng nghe kinh nghiệm thực tế của anh/chị nhằm kiểm chứng cũng như bổ sung cho danh sách đó.</w:t>
-      </w:r>
-    </w:p>
-    <w:p>
-      <w:pPr>
-        <w:spacing w:beforeLines="60" w:before="144" w:afterLines="100" w:after="240" w:line="312" w:lineRule="auto"/>
-        <w:rPr>
-          <w:rFonts w:asciiTheme="majorHAnsi" w:hAnsiTheme="majorHAnsi" w:cstheme="majorHAnsi"/>
-        </w:rPr>
-      </w:pPr>
-      <w:r>
-        <w:rPr>
-          <w:rFonts w:asciiTheme="majorHAnsi" w:hAnsiTheme="majorHAnsi" w:cstheme="majorHAnsi"/>
-        </w:rPr>
-        <w:lastRenderedPageBreak/>
+        <w:t>"Em chào anh/chị, cảm ơn anh/chị đã dành thời gian cho buổi trao đổi hôm nay. Em là [tên], sinh viên [trường/lớp]. Nhóm em đang thực hiện một nghiên cứu học thuật nhằm xây dựng bộ tiêu chí ra quyết định mua laptop dành cho nhân viên văn phòng tại Việt Nam. Nhóm em đã tổng hợp một danh sách tiêu chí từ các nghiên cứu quốc tế, và buổi trao đổi này là để lắng nghe kinh nghiệm thực tế của anh/chị nhằm kiểm chứng cũng như bổ sung cho danh sách đó.</w:t>
+      </w:r>
+    </w:p>
+    <w:p>
+      <w:pPr>
+        <w:spacing w:beforeLines="60" w:before="144" w:afterLines="100" w:after="240" w:line="312" w:lineRule="auto"/>
+        <w:rPr>
+          <w:rFonts w:asciiTheme="majorHAnsi" w:hAnsiTheme="majorHAnsi" w:cstheme="majorHAnsi"/>
+        </w:rPr>
+      </w:pPr>
+      <w:r>
+        <w:rPr>
+          <w:rFonts w:asciiTheme="majorHAnsi" w:hAnsiTheme="majorHAnsi" w:cstheme="majorHAnsi"/>
+        </w:rPr>
         <w:t>Buổi phỏng vấn dự kiến kéo dài khoảng 20 đến 30 phút. Em xin nêu vài điểm về đạo đức nghiên cứu để anh/chị yên tâm chia sẻ. Mọi thông tin định danh cá nhân của anh/chị sẽ được giữ ẩn danh và chỉ phục vụ mục đích học thuật. Buổi trao đổi này không ghi âm; em chỉ ghi chú lại các ý chính bằng văn bản. Anh/chị có quyền từ chối trả lời bất kỳ câu hỏi nào, hoặc dừng buổi phỏng vấn bất cứ lúc nào mà không cần giải thích.</w:t>
       </w:r>
     </w:p>
@@ -508,7 +581,7 @@
         <w:rPr>
           <w:rFonts w:asciiTheme="majorHAnsi" w:hAnsiTheme="majorHAnsi" w:cstheme="majorHAnsi"/>
         </w:rPr>
-        <w:t xml:space="preserve"> Anh/chị thử nhớ lại lần gần nhất tư vấn hoặc chọn giúp một laptop cho nhân viên văn phòng trong tầm giá này. Khi đó điều đầu tiên anh/chị cân nhắc, hoặc điều khách hàng hỏi tới đầu tiên, là gì?</w:t>
+        <w:t xml:space="preserve"> Anh/chị thử nhớ lại lần gần nhất tư vấn hoặc chọn giúp một laptop cho nhân viên văn phòng. Khi đó điều đầu tiên anh/chị cân nhắc, hoặc điều khách hàng hỏi tới đầu tiên, là gì?</w:t>
       </w:r>
     </w:p>
     <w:p>
@@ -605,6 +678,7 @@
           <w:sz w:val="24"/>
           <w:szCs w:val="24"/>
         </w:rPr>
+        <w:lastRenderedPageBreak/>
         <w:t>Phần 2 — Phản biện tiêu chí có thẻ kích thích (4 câu)</w:t>
       </w:r>
     </w:p>
@@ -661,7 +735,7 @@
         <w:rPr>
           <w:rFonts w:asciiTheme="majorHAnsi" w:hAnsiTheme="majorHAnsi" w:cstheme="majorHAnsi"/>
         </w:rPr>
-        <w:t xml:space="preserve"> Ở tầm giá 20-25 triệu, khách hàng văn phòng thường phải cân nhắc giữa một máy có GPU rời cơ bản và một máy dồn ngân sách cho CPU hoặc RAM lớn hơn. Theo kinh nghiệm của anh/chị, họ nghiêng về hướng nào, và vì sao?</w:t>
+        <w:t xml:space="preserve"> Khi chọn laptop văn phòng, khách hàng thường phải cân nhắc giữa một máy có GPU rời cơ bản và một máy dồn ngân sách cho CPU hoặc RAM lớn hơn. Theo kinh nghiệm của anh/chị, họ nghiêng về hướng nào, và vì sao?</w:t>
       </w:r>
     </w:p>
     <w:p>
@@ -679,7 +753,6 @@
         <w:rPr>
           <w:rFonts w:asciiTheme="majorHAnsi" w:hAnsiTheme="majorHAnsi" w:cstheme="majorHAnsi"/>
         </w:rPr>
-        <w:lastRenderedPageBreak/>
         <w:t>Thăm dò (process probe): Anh/chị đi đến nhận định đó dựa trên trường hợp hay cơ sở nào?</w:t>
       </w:r>
     </w:p>
@@ -869,6 +942,7 @@
           <w:rFonts w:asciiTheme="majorHAnsi" w:hAnsiTheme="majorHAnsi" w:cstheme="majorHAnsi"/>
           <w:b/>
         </w:rPr>
+        <w:lastRenderedPageBreak/>
         <w:t>Câu 8.</w:t>
       </w:r>
       <w:r>
@@ -962,14 +1036,13 @@
           <w:rFonts w:asciiTheme="majorHAnsi" w:hAnsiTheme="majorHAnsi" w:cstheme="majorHAnsi"/>
           <w:b/>
         </w:rPr>
-        <w:lastRenderedPageBreak/>
         <w:t>Câu 10.</w:t>
       </w:r>
       <w:r>
         <w:rPr>
           <w:rFonts w:asciiTheme="majorHAnsi" w:hAnsiTheme="majorHAnsi" w:cstheme="majorHAnsi"/>
         </w:rPr>
-        <w:t xml:space="preserve"> Em xin đưa ra một tình huống giả định. Có hai máy cùng giá 22 triệu: máy A pin khoảng 10 tiếng nhưng nặng 1,8 kg và màn hình thường; máy B pin khoảng 6 tiếng, nhẹ 1,3 kg và màn hình đẹp hơn hẳn. Nếu một khách hàng văn phòng nhờ tư vấn, anh/chị nghiêng về máy nào, và lý do là gì?</w:t>
+        <w:t xml:space="preserve"> Em xin đưa ra một tình huống giả định. Có hai máy cùng phân khúc giá: máy A pin khoảng 10 tiếng nhưng nặng 1,8 kg và màn hình thường; máy B pin khoảng 6 tiếng, nhẹ 1,3 kg và màn hình đẹp hơn hẳn. Nếu một khách hàng văn phòng nhờ tư vấn, anh/chị nghiêng về máy nào, và lý do là gì?</w:t>
       </w:r>
     </w:p>
     <w:p>
@@ -1098,6 +1171,7 @@
           <w:sz w:val="24"/>
           <w:szCs w:val="24"/>
         </w:rPr>
+        <w:lastRenderedPageBreak/>
         <w:t>Phụ lục A — Ma trận mục tiêu phỏng vấn và câu hỏi nghiên cứu</w:t>
       </w:r>
     </w:p>
@@ -1264,7 +1338,6 @@
                 <w:rFonts w:asciiTheme="majorHAnsi" w:hAnsiTheme="majorHAnsi" w:cstheme="majorHAnsi"/>
                 <w:lang w:val="fr-FR"/>
               </w:rPr>
-              <w:lastRenderedPageBreak/>
               <w:t>IO-B — Chênh lệch giữa lý thuyết và thực tiễn Việt Nam</w:t>
             </w:r>
           </w:p>
@@ -1545,7 +1618,14 @@
         <w:rPr>
           <w:rFonts w:asciiTheme="majorHAnsi" w:hAnsiTheme="majorHAnsi" w:cstheme="majorHAnsi"/>
         </w:rPr>
-        <w:t xml:space="preserve"> Nghiên cứu của Maghsoudi và cộng sự (2026) trên thị trường laptop ghi nhận CPU và RAM là hai tiêu chí được chuyên gia đánh giá quan trọng nhất, với điểm trọng số 0,8333 cho mỗi tiêu chí, trong khi GPU đạt 0,6083 và xếp hạng thứ mười trong kết quả TOPSIS. Nhóm tác giả cũng nhận thấy người dùng chuyên nghiệp quan tâm nhiều đến màn hình và bàn phím, còn hiệu năng GPU chủ yếu thuộc mối quan tâm của người chơi game, nên GPU rời có xu hướng trở thành trang bị dư thừa đối với nhu cầu văn phòng.</w:t>
+        <w:t xml:space="preserve"> Nghiên cứu của Maghsoudi và cộng sự (2026) trên thị trường laptop ghi nhận CPU và RAM là hai tiêu chí được chuyên gia đánh giá quan trọng nhất, với điểm trọng số 0,8333 cho mỗi tiêu chí, trong khi GPU đạt 0,6083 và xếp hạng thứ mười trong kết quả TOPSIS. Nhóm tác giả cũng nhận thấy người </w:t>
+      </w:r>
+      <w:r>
+        <w:rPr>
+          <w:rFonts w:asciiTheme="majorHAnsi" w:hAnsiTheme="majorHAnsi" w:cstheme="majorHAnsi"/>
+        </w:rPr>
+        <w:lastRenderedPageBreak/>
+        <w:t>dùng chuyên nghiệp quan tâm nhiều đến màn hình và bàn phím, còn hiệu năng GPU chủ yếu thuộc mối quan tâm của người chơi game, nên GPU rời có xu hướng trở thành trang bị dư thừa đối với nhu cầu văn phòng.</w:t>
       </w:r>
     </w:p>
     <w:p>
@@ -1587,14 +1667,7 @@
         <w:rPr>
           <w:rFonts w:asciiTheme="majorHAnsi" w:hAnsiTheme="majorHAnsi" w:cstheme="majorHAnsi"/>
         </w:rPr>
-        <w:t xml:space="preserve"> Nghiên cứu của Sönmez Çakır và Pekkaya (2020) trên bài toán lựa chọn laptop xác định hình ảnh thương hiệu là tiêu chí quan trọng nhất, đồng thời hoạt động như một tiêu chí chuyển tiếp chi phối cả nhận thức của người mua về giá lẫn chất lượng. Về dịch vụ hậu mãi, Maghsoudi và cộng sự (2026) cho thấy bảo hành đạt điểm quan trọng 0,6667 nhưng chỉ xếp thứ tám trong kết </w:t>
-      </w:r>
-      <w:r>
-        <w:rPr>
-          <w:rFonts w:asciiTheme="majorHAnsi" w:hAnsiTheme="majorHAnsi" w:cstheme="majorHAnsi"/>
-        </w:rPr>
-        <w:lastRenderedPageBreak/>
-        <w:t>quả TOPSIS. Cùng nghiên cứu này ghi nhận tiếng ồn quạt tản nhiệt nhận tới 85,1% phản hồi tiêu cực và cục sạc nhận 68,33% phản hồi tiêu cực, song mức ảnh hưởng của chúng đến quyết định mua chỉ ở 0,25; nhóm tác giả lý giải rằng một đặc điểm gây phản ứng cảm xúc mạnh chưa chắc đã dẫn dắt quyết định mua hàng.</w:t>
+        <w:t xml:space="preserve"> Nghiên cứu của Sönmez Çakır và Pekkaya (2020) trên bài toán lựa chọn laptop xác định hình ảnh thương hiệu là tiêu chí quan trọng nhất, đồng thời hoạt động như một tiêu chí chuyển tiếp chi phối cả nhận thức của người mua về giá lẫn chất lượng. Về dịch vụ hậu mãi, Maghsoudi và cộng sự (2026) cho thấy bảo hành đạt điểm quan trọng 0,6667 nhưng chỉ xếp thứ tám trong kết quả TOPSIS. Cùng nghiên cứu này ghi nhận tiếng ồn quạt tản nhiệt nhận tới 85,1% phản hồi tiêu cực và cục sạc nhận 68,33% phản hồi tiêu cực, song mức ảnh hưởng của chúng đến quyết định mua chỉ ở 0,25; nhóm tác giả lý giải rằng một đặc điểm gây phản ứng cảm xúc mạnh chưa chắc đã dẫn dắt quyết định mua hàng.</w:t>
       </w:r>
     </w:p>
     <w:p>
@@ -2058,6 +2131,7 @@
               <w:rPr>
                 <w:rFonts w:asciiTheme="majorHAnsi" w:hAnsiTheme="majorHAnsi" w:cstheme="majorHAnsi"/>
               </w:rPr>
+              <w:lastRenderedPageBreak/>
               <w:t>...</w:t>
             </w:r>
           </w:p>
@@ -2183,7 +2257,6 @@
         <w:rPr>
           <w:rFonts w:asciiTheme="majorHAnsi" w:hAnsiTheme="majorHAnsi" w:cstheme="majorHAnsi"/>
         </w:rPr>
-        <w:lastRenderedPageBreak/>
         <w:t>Maghsoudi, M., Bakhtiari, M., &amp; Bakhtiari, H. (2026). A hybrid framework for notebook market analysis integrating social media sentiment mining with expert knowledge for feature prioritization. PLOS One, 21(2), e0342067.</w:t>
       </w:r>
     </w:p>
@@ -2228,7 +2301,7 @@
         <w:rPr>
           <w:rFonts w:asciiTheme="majorHAnsi" w:hAnsiTheme="majorHAnsi" w:cstheme="majorHAnsi"/>
         </w:rPr>
-        <w:t>Ghi chú nội bộ (không đọc cho chuyên gia): phần mô tả bối cảnh trong 04_bao-cao-latex/chapters/01-introduction.tex hiện dùng persona "người thiết kế đồ họa", chưa khớp với "nhân viên văn phòng" ở tài liệu tiêu chí v5.0 và kế hoạch Phase 2. Nhóm nên thống nhất persona trước khi hoàn thiện báo cáo. Bản kịch bản này dùng nhất quán "nhân viên văn phòng".</w:t>
+        <w:t>Ghi chú nội bộ (không đọc cho chuyên gia): scope hiện hành của dự án là bộ tiêu chí mua laptop cho nhân viên văn phòng tại Việt Nam; không khóa trước một mức giá cụ thể. Nếu cần lọc dữ liệu thị trường theo giá, nhóm sẽ chốt rule lọc riêng ở Phase 5.</w:t>
       </w:r>
     </w:p>
     <w:sectPr>

</xml_diff>